<commit_message>
Tau manuscript: state Y-scrambling as the count of permutations, not p x 100
Co-Authored-By: Claude Opus 5.5 <noreply@anthropic.com>
</commit_message>
<xml_diff>
--- a/manuscript/submission/Manuscript_Tau_Borophene_JMM.docx
+++ b/manuscript/submission/Manuscript_Tau_Borophene_JMM.docx
@@ -2411,7 +2411,39 @@
       </w:r>
       <w:r>
         <w:rPr/>
-        <w:t xml:space="preserve">; Table 2, Fig. 7). Only 0.4% of 1,000 permuted targets did as well, so the signal is real, but it is weak and uneven: the outer-fold </w:t>
+        <w:t xml:space="preserve">; Table 2, Fig. 7). Only 3 of 1,000 permuted targets gave a </w:t>
+      </w:r>
+      <w:r>
+        <w:rPr>
+          <w:i/>
+        </w:rPr>
+        <w:t>Q</w:t>
+      </w:r>
+      <w:r>
+        <w:rPr>
+          <w:vertAlign w:val="superscript"/>
+        </w:rPr>
+        <w:t>2</w:t>
+      </w:r>
+      <w:r>
+        <w:rPr>
+          <w:vertAlign w:val="subscript"/>
+        </w:rPr>
+        <w:t>CV</w:t>
+      </w:r>
+      <w:r>
+        <w:rPr/>
+        <w:t xml:space="preserve"> as high (</w:t>
+      </w:r>
+      <w:r>
+        <w:rPr>
+          <w:i/>
+        </w:rPr>
+        <w:t>p</w:t>
+      </w:r>
+      <w:r>
+        <w:rPr/>
+        <w:t xml:space="preserve"> = 0.004), so the signal is real, but it is weak and uneven: the outer-fold </w:t>
       </w:r>
       <w:r>
         <w:rPr>

</xml_diff>

<commit_message>
Springer (J Mol Model) compliance: Statements and Declarations after references, captions without final period, SI header + PDF, abbreviations defined in abstract, placeholder for the AI-use statement
Co-Authored-By: Claude Opus 5.5 <noreply@anthropic.com>
</commit_message>
<xml_diff>
--- a/manuscript/submission/Manuscript_Tau_Borophene_JMM.docx
+++ b/manuscript/submission/Manuscript_Tau_Borophene_JMM.docx
@@ -112,7 +112,7 @@
       </w:r>
       <w:r>
         <w:rPr/>
-        <w:t xml:space="preserve"> borophene, a candidate carrier. Docking into the ligand-free fibril does not reproduce the tracer pose (RMSD 6.7 and 6.3 Å); the docking scores are therefore exploratory. An unconstrained finite borophene flake collapses into a compact boron cluster during adsorption, so the carrier was modelled as a planar B</w:t>
+        <w:t xml:space="preserve"> borophene. Docking into the ligand-free fibril does not reproduce the tracer pose (root-mean-square deviation 6.7 and 6.3 Å); the docking scores are therefore exploratory. An unconstrained finite borophene flake collapses into a compact boron cluster during adsorption, so the carrier was modelled as a planar B</w:t>
       </w:r>
       <w:r>
         <w:rPr>
@@ -229,7 +229,7 @@
       </w:r>
       <w:r>
         <w:rPr/>
-        <w:t xml:space="preserve"> lattice; each drug was adsorbed from four relaxed orientations and the regime was assigned from drug–carrier bond formation. Ridge QSPR models were assessed by nested 5×5 cross-validation, 1,000-fold Y-scrambling and a leverage applicability domain.</w:t>
+        <w:t xml:space="preserve"> lattice; each drug was adsorbed from four relaxed orientations and the regime was assigned from drug–carrier bond formation. Ridge quantitative structure–property relationship (QSPR) models were assessed by nested 5×5 cross-validation, 1,000-fold Y-scrambling and a leverage applicability domain.</w:t>
       </w:r>
     </w:p>
     <w:p>
@@ -331,7 +331,7 @@
       </w:pPr>
       <w:r>
         <w:rPr/>
-        <w:t>The cohort comprises 29 compounds. Every structure was retrieved from PubChem by name [15] and its identity checked by InChIKey (Table S1). Counter-ions were removed and acids and bases neutralised where a neutral form exists; the phenothiazinium dyes and thioflavin T keep their permanent positive charge. Thioflavin S, a mixture of sulfonated oligomers rather than a single compound, was excluded, leaving 28 drugs in four families: 8 dyes and imaging probes, 11 polyphenols, 4 aggregation or kinase modulators and 5 symptomatic Alzheimer drugs.</w:t>
+        <w:t>The cohort comprises 29 compounds. Every structure was retrieved from PubChem by name [15] and its identity checked by InChIKey (Online Resource 1, Table S1). Counter-ions were removed and acids and bases neutralised where a neutral form exists; the phenothiazinium dyes and thioflavin T keep their permanent positive charge. Thioflavin S, a mixture of sulfonated oligomers rather than a single compound, was excluded, leaving 28 drugs in four families: 8 dyes and imaging probes, 11 polyphenols, 4 aggregation or kinase modulators and 5 symptomatic Alzheimer drugs.</w:t>
       </w:r>
     </w:p>
     <w:p>
@@ -670,6 +670,24 @@
       <w:r>
         <w:rPr/>
         <w:t>, standardised residuals within ±3).</w:t>
+      </w:r>
+    </w:p>
+    <w:p>
+      <w:pPr>
+        <w:pStyle w:val="Heading2"/>
+      </w:pPr>
+      <w:r>
+        <w:rPr/>
+        <w:t>Use of AI tools</w:t>
+      </w:r>
+    </w:p>
+    <w:p>
+      <w:r>
+        <w:rPr>
+          <w:b/>
+          <w:highlight w:val="yellow"/>
+        </w:rPr>
+        <w:t>[AUTHOR TO COMPLETE BEFORE SUBMISSION: statement on the use of AI tools in this work, as required by the journal (Springer policy: use of large language models beyond copy editing must be documented in the Methods).]</w:t>
       </w:r>
     </w:p>
     <w:p>
@@ -766,7 +784,7 @@
         <w:rPr>
           <w:sz w:val="20"/>
         </w:rPr>
-        <w:t xml:space="preserve"> borophene model, GFN2-xTB adsorption, and the QSPR model with its validation. The inset of the last stage is the out-of-fold parity plot of Fig. 7a.</w:t>
+        <w:t xml:space="preserve"> borophene model, GFN2-xTB adsorption, and the QSPR model with its validation. The inset of the last stage is the out-of-fold parity plot of Fig. 7a</w:t>
       </w:r>
     </w:p>
     <w:p>
@@ -896,7 +914,7 @@
         <w:rPr>
           <w:sz w:val="20"/>
         </w:rPr>
-        <w:t xml:space="preserve"> Percentage of the 28 drugs whose top pose contacts each residue (light bars, any heavy atom within 4.0 Å; dark bars, N/O pairs within 3.5 Å).</w:t>
+        <w:t xml:space="preserve"> Percentage of the 28 drugs whose top pose contacts each residue (light bars, any heavy atom within 4.0 Å; dark bars, N/O pairs within 3.5 Å)</w:t>
       </w:r>
     </w:p>
     <w:p>
@@ -1020,7 +1038,7 @@
         <w:rPr>
           <w:sz w:val="20"/>
         </w:rPr>
-        <w:t xml:space="preserve"> sheet against the Vina score; open symbols, chemisorbed complexes.</w:t>
+        <w:t xml:space="preserve"> sheet against the Vina score; open symbols, chemisorbed complexes</w:t>
       </w:r>
     </w:p>
     <w:p>
@@ -1199,7 +1217,7 @@
         <w:rPr>
           <w:sz w:val="20"/>
         </w:rPr>
-        <w:t xml:space="preserve"> GFN2-xTB HOMO (circles) and LUMO (squares) of the relaxed drugs, sorted by gap and coloured by family; dashed line, Fermi level of the sheet.</w:t>
+        <w:t xml:space="preserve"> GFN2-xTB HOMO (circles) and LUMO (squares) of the relaxed drugs, sorted by gap and coloured by family; dashed line, Fermi level of the sheet</w:t>
       </w:r>
     </w:p>
     <w:p>
@@ -1512,7 +1530,7 @@
         <w:rPr>
           <w:sz w:val="20"/>
         </w:rPr>
-        <w:t xml:space="preserve"> by family; boxes show the median and interquartile range.</w:t>
+        <w:t xml:space="preserve"> by family; boxes show the median and interquartile range</w:t>
       </w:r>
     </w:p>
     <w:p>
@@ -1616,7 +1634,7 @@
         <w:rPr>
           <w:sz w:val="20"/>
         </w:rPr>
-        <w:t xml:space="preserve"> Congo Red, which transferred a proton to the sheet. Colours: B pink, C grey, N blue, O red, S yellow, H white.</w:t>
+        <w:t xml:space="preserve"> Congo Red, which transferred a proton to the sheet. Colours: B pink, C grey, N blue, O red, S yellow, H white</w:t>
       </w:r>
     </w:p>
     <w:p>
@@ -2640,7 +2658,7 @@
         <w:rPr>
           <w:sz w:val="20"/>
         </w:rPr>
-        <w:t xml:space="preserve"> over 1,000 permuted targets, with the value of the model.</w:t>
+        <w:t xml:space="preserve"> over 1,000 permuted targets, with the value of the model</w:t>
       </w:r>
     </w:p>
     <w:p>
@@ -3285,167 +3303,6 @@
       </w:pPr>
       <w:r>
         <w:rPr/>
-        <w:t>Declarations</w:t>
-      </w:r>
-    </w:p>
-    <w:p>
-      <w:pPr>
-        <w:jc w:val="both"/>
-      </w:pPr>
-      <w:r>
-        <w:rPr>
-          <w:b/>
-        </w:rPr>
-        <w:t>Author contribution</w:t>
-      </w:r>
-      <w:r>
-        <w:rPr/>
-        <w:t xml:space="preserve"> </w:t>
-      </w:r>
-      <w:r>
-        <w:rPr/>
-        <w:t>Andrés Monreal Hernández conceived the study, performed all calculations and analyses, and wrote the manuscript.</w:t>
-      </w:r>
-    </w:p>
-    <w:p>
-      <w:pPr>
-        <w:jc w:val="both"/>
-      </w:pPr>
-      <w:r>
-        <w:rPr>
-          <w:b/>
-        </w:rPr>
-        <w:t>Funding</w:t>
-      </w:r>
-      <w:r>
-        <w:rPr/>
-        <w:t xml:space="preserve"> </w:t>
-      </w:r>
-      <w:r>
-        <w:rPr/>
-        <w:t>No funding was received for this work.</w:t>
-      </w:r>
-    </w:p>
-    <w:p>
-      <w:pPr>
-        <w:jc w:val="both"/>
-      </w:pPr>
-      <w:r>
-        <w:rPr>
-          <w:b/>
-        </w:rPr>
-        <w:t>Data availability</w:t>
-      </w:r>
-      <w:r>
-        <w:rPr/>
-        <w:t xml:space="preserve"> </w:t>
-      </w:r>
-      <w:r>
-        <w:rPr/>
-        <w:t>All input structures, relaxed geometries, docking poses, xtb outputs and result tables are available at https://github.com/sircalch/borophene-alzheimer-tau-ai.</w:t>
-      </w:r>
-    </w:p>
-    <w:p>
-      <w:pPr>
-        <w:jc w:val="both"/>
-      </w:pPr>
-      <w:r>
-        <w:rPr>
-          <w:b/>
-        </w:rPr>
-        <w:t>Code availability</w:t>
-      </w:r>
-      <w:r>
-        <w:rPr/>
-        <w:t xml:space="preserve"> </w:t>
-      </w:r>
-      <w:r>
-        <w:rPr/>
-        <w:t>The complete pipeline, which regenerates every number, table and figure of this article from the raw inputs, is available at https://github.com/sircalch/borophene-alzheimer-tau-ai under the MIT licence. Software: xtb 6.7.1, AutoDock Vina 1.2.7, Meeko, RDKit, PDBFixer/OpenMM, scikit-learn, PyMOL (open source).</w:t>
-      </w:r>
-    </w:p>
-    <w:p>
-      <w:pPr>
-        <w:jc w:val="both"/>
-      </w:pPr>
-      <w:r>
-        <w:rPr>
-          <w:b/>
-        </w:rPr>
-        <w:t>Ethics approval</w:t>
-      </w:r>
-      <w:r>
-        <w:rPr/>
-        <w:t xml:space="preserve"> </w:t>
-      </w:r>
-      <w:r>
-        <w:rPr/>
-        <w:t>Not applicable.</w:t>
-      </w:r>
-    </w:p>
-    <w:p>
-      <w:pPr>
-        <w:jc w:val="both"/>
-      </w:pPr>
-      <w:r>
-        <w:rPr>
-          <w:b/>
-        </w:rPr>
-        <w:t>Consent to participate</w:t>
-      </w:r>
-      <w:r>
-        <w:rPr/>
-        <w:t xml:space="preserve"> </w:t>
-      </w:r>
-      <w:r>
-        <w:rPr/>
-        <w:t>Not applicable.</w:t>
-      </w:r>
-    </w:p>
-    <w:p>
-      <w:pPr>
-        <w:jc w:val="both"/>
-      </w:pPr>
-      <w:r>
-        <w:rPr>
-          <w:b/>
-        </w:rPr>
-        <w:t>Consent for publication</w:t>
-      </w:r>
-      <w:r>
-        <w:rPr/>
-        <w:t xml:space="preserve"> </w:t>
-      </w:r>
-      <w:r>
-        <w:rPr/>
-        <w:t>Not applicable.</w:t>
-      </w:r>
-    </w:p>
-    <w:p>
-      <w:pPr>
-        <w:jc w:val="both"/>
-      </w:pPr>
-      <w:r>
-        <w:rPr>
-          <w:b/>
-        </w:rPr>
-        <w:t>Competing interests</w:t>
-      </w:r>
-      <w:r>
-        <w:rPr/>
-        <w:t xml:space="preserve"> </w:t>
-      </w:r>
-      <w:r>
-        <w:rPr/>
-        <w:t>The author declares no competing interests.</w:t>
-      </w:r>
-    </w:p>
-    <w:p>
-      <w:pPr>
-        <w:pStyle w:val="Heading1"/>
-      </w:pPr>
-      <w:r>
-        <w:rPr/>
         <w:t>References</w:t>
       </w:r>
     </w:p>
@@ -3831,6 +3688,167 @@
           <w:sz w:val="20"/>
         </w:rPr>
         <w:t>32. Kitchen DB, Decornez H, Furr JR, Bajorath J (2004) Docking and scoring in virtual screening for drug discovery: methods and applications. Nat Rev Drug Discov 3:935–949. https://doi.org/10.1038/nrd1549</w:t>
+      </w:r>
+    </w:p>
+    <w:p>
+      <w:pPr>
+        <w:pStyle w:val="Heading1"/>
+      </w:pPr>
+      <w:r>
+        <w:rPr/>
+        <w:t>Statements and Declarations</w:t>
+      </w:r>
+    </w:p>
+    <w:p>
+      <w:pPr>
+        <w:jc w:val="both"/>
+      </w:pPr>
+      <w:r>
+        <w:rPr>
+          <w:b/>
+        </w:rPr>
+        <w:t>Author contribution</w:t>
+      </w:r>
+      <w:r>
+        <w:rPr/>
+        <w:t xml:space="preserve"> </w:t>
+      </w:r>
+      <w:r>
+        <w:rPr/>
+        <w:t>Andrés Monreal Hernández conceived the study, performed all calculations and analyses, and wrote the manuscript.</w:t>
+      </w:r>
+    </w:p>
+    <w:p>
+      <w:pPr>
+        <w:jc w:val="both"/>
+      </w:pPr>
+      <w:r>
+        <w:rPr>
+          <w:b/>
+        </w:rPr>
+        <w:t>Funding</w:t>
+      </w:r>
+      <w:r>
+        <w:rPr/>
+        <w:t xml:space="preserve"> </w:t>
+      </w:r>
+      <w:r>
+        <w:rPr/>
+        <w:t>No funding was received for this work.</w:t>
+      </w:r>
+    </w:p>
+    <w:p>
+      <w:pPr>
+        <w:jc w:val="both"/>
+      </w:pPr>
+      <w:r>
+        <w:rPr>
+          <w:b/>
+        </w:rPr>
+        <w:t>Data availability</w:t>
+      </w:r>
+      <w:r>
+        <w:rPr/>
+        <w:t xml:space="preserve"> </w:t>
+      </w:r>
+      <w:r>
+        <w:rPr/>
+        <w:t>All input structures, relaxed geometries, docking poses, xtb outputs and result tables are available at https://github.com/sircalch/borophene-alzheimer-tau-ai.</w:t>
+      </w:r>
+    </w:p>
+    <w:p>
+      <w:pPr>
+        <w:jc w:val="both"/>
+      </w:pPr>
+      <w:r>
+        <w:rPr>
+          <w:b/>
+        </w:rPr>
+        <w:t>Code availability</w:t>
+      </w:r>
+      <w:r>
+        <w:rPr/>
+        <w:t xml:space="preserve"> </w:t>
+      </w:r>
+      <w:r>
+        <w:rPr/>
+        <w:t>The complete pipeline, which regenerates every number, table and figure of this article from the raw inputs, is available at https://github.com/sircalch/borophene-alzheimer-tau-ai under the MIT licence. Software: xtb 6.7.1, AutoDock Vina 1.2.7, Meeko, RDKit, PDBFixer/OpenMM, scikit-learn, PyMOL (open source).</w:t>
+      </w:r>
+    </w:p>
+    <w:p>
+      <w:pPr>
+        <w:jc w:val="both"/>
+      </w:pPr>
+      <w:r>
+        <w:rPr>
+          <w:b/>
+        </w:rPr>
+        <w:t>Ethics approval</w:t>
+      </w:r>
+      <w:r>
+        <w:rPr/>
+        <w:t xml:space="preserve"> </w:t>
+      </w:r>
+      <w:r>
+        <w:rPr/>
+        <w:t>Not applicable.</w:t>
+      </w:r>
+    </w:p>
+    <w:p>
+      <w:pPr>
+        <w:jc w:val="both"/>
+      </w:pPr>
+      <w:r>
+        <w:rPr>
+          <w:b/>
+        </w:rPr>
+        <w:t>Consent to participate</w:t>
+      </w:r>
+      <w:r>
+        <w:rPr/>
+        <w:t xml:space="preserve"> </w:t>
+      </w:r>
+      <w:r>
+        <w:rPr/>
+        <w:t>Not applicable.</w:t>
+      </w:r>
+    </w:p>
+    <w:p>
+      <w:pPr>
+        <w:jc w:val="both"/>
+      </w:pPr>
+      <w:r>
+        <w:rPr>
+          <w:b/>
+        </w:rPr>
+        <w:t>Consent for publication</w:t>
+      </w:r>
+      <w:r>
+        <w:rPr/>
+        <w:t xml:space="preserve"> </w:t>
+      </w:r>
+      <w:r>
+        <w:rPr/>
+        <w:t>Not applicable.</w:t>
+      </w:r>
+    </w:p>
+    <w:p>
+      <w:pPr>
+        <w:jc w:val="both"/>
+      </w:pPr>
+      <w:r>
+        <w:rPr>
+          <w:b/>
+        </w:rPr>
+        <w:t>Competing interests</w:t>
+      </w:r>
+      <w:r>
+        <w:rPr/>
+        <w:t xml:space="preserve"> </w:t>
+      </w:r>
+      <w:r>
+        <w:rPr/>
+        <w:t>The author declares no competing interests.</w:t>
       </w:r>
     </w:p>
     <w:sectPr>

</xml_diff>

<commit_message>
figures: Springer lettering and width; Fig. 1 card text fits at 7 pt
- style.save(): true minus signs, 7 pt minimum lettering, 174 mm double column
- figkit: leader lines as annotations; denser log-axis ticks

Co-Authored-By: Claude Opus 5.5 <noreply@anthropic.com>
</commit_message>
<xml_diff>
--- a/manuscript/submission/Manuscript_Tau_Borophene_JMM.docx
+++ b/manuscript/submission/Manuscript_Tau_Borophene_JMM.docx
@@ -717,7 +717,7 @@
       <w:r>
         <w:drawing>
           <wp:inline xmlns:a="http://schemas.openxmlformats.org/drawingml/2006/main" xmlns:pic="http://schemas.openxmlformats.org/drawingml/2006/picture">
-            <wp:extent cx="6264000" cy="2112244"/>
+            <wp:extent cx="6264000" cy="2124578"/>
             <wp:docPr id="1" name="Picture 1"/>
             <wp:cNvGraphicFramePr>
               <a:graphicFrameLocks noChangeAspect="1"/>
@@ -738,7 +738,7 @@
                   <pic:spPr>
                     <a:xfrm>
                       <a:off x="0" y="0"/>
-                      <a:ext cx="6264000" cy="2112244"/>
+                      <a:ext cx="6264000" cy="2124578"/>
                     </a:xfrm>
                     <a:prstGeom prst="rect"/>
                   </pic:spPr>
@@ -834,7 +834,7 @@
       <w:r>
         <w:drawing>
           <wp:inline xmlns:a="http://schemas.openxmlformats.org/drawingml/2006/main" xmlns:pic="http://schemas.openxmlformats.org/drawingml/2006/picture">
-            <wp:extent cx="6264000" cy="2917458"/>
+            <wp:extent cx="6264000" cy="2930142"/>
             <wp:docPr id="2" name="Picture 2"/>
             <wp:cNvGraphicFramePr>
               <a:graphicFrameLocks noChangeAspect="1"/>
@@ -855,7 +855,7 @@
                   <pic:spPr>
                     <a:xfrm>
                       <a:off x="0" y="0"/>
-                      <a:ext cx="6264000" cy="2917458"/>
+                      <a:ext cx="6264000" cy="2930142"/>
                     </a:xfrm>
                     <a:prstGeom prst="rect"/>
                   </pic:spPr>
@@ -925,7 +925,7 @@
       <w:r>
         <w:drawing>
           <wp:inline xmlns:a="http://schemas.openxmlformats.org/drawingml/2006/main" xmlns:pic="http://schemas.openxmlformats.org/drawingml/2006/picture">
-            <wp:extent cx="6264000" cy="3265678"/>
+            <wp:extent cx="6264000" cy="3284599"/>
             <wp:docPr id="3" name="Picture 3"/>
             <wp:cNvGraphicFramePr>
               <a:graphicFrameLocks noChangeAspect="1"/>
@@ -946,7 +946,7 @@
                   <pic:spPr>
                     <a:xfrm>
                       <a:off x="0" y="0"/>
-                      <a:ext cx="6264000" cy="3265678"/>
+                      <a:ext cx="6264000" cy="3284599"/>
                     </a:xfrm>
                     <a:prstGeom prst="rect"/>
                   </pic:spPr>
@@ -1098,7 +1098,7 @@
       <w:r>
         <w:drawing>
           <wp:inline xmlns:a="http://schemas.openxmlformats.org/drawingml/2006/main" xmlns:pic="http://schemas.openxmlformats.org/drawingml/2006/picture">
-            <wp:extent cx="6264000" cy="2716317"/>
+            <wp:extent cx="6264000" cy="2884310"/>
             <wp:docPr id="4" name="Picture 4"/>
             <wp:cNvGraphicFramePr>
               <a:graphicFrameLocks noChangeAspect="1"/>
@@ -1119,7 +1119,7 @@
                   <pic:spPr>
                     <a:xfrm>
                       <a:off x="0" y="0"/>
-                      <a:ext cx="6264000" cy="2716317"/>
+                      <a:ext cx="6264000" cy="2884310"/>
                     </a:xfrm>
                     <a:prstGeom prst="rect"/>
                   </pic:spPr>
@@ -1397,7 +1397,7 @@
       <w:r>
         <w:drawing>
           <wp:inline xmlns:a="http://schemas.openxmlformats.org/drawingml/2006/main" xmlns:pic="http://schemas.openxmlformats.org/drawingml/2006/picture">
-            <wp:extent cx="6264000" cy="2848912"/>
+            <wp:extent cx="6264000" cy="2870849"/>
             <wp:docPr id="5" name="Picture 5"/>
             <wp:cNvGraphicFramePr>
               <a:graphicFrameLocks noChangeAspect="1"/>
@@ -1418,7 +1418,7 @@
                   <pic:spPr>
                     <a:xfrm>
                       <a:off x="0" y="0"/>
-                      <a:ext cx="6264000" cy="2848912"/>
+                      <a:ext cx="6264000" cy="2870849"/>
                     </a:xfrm>
                     <a:prstGeom prst="rect"/>
                   </pic:spPr>
@@ -1541,7 +1541,7 @@
       <w:r>
         <w:drawing>
           <wp:inline xmlns:a="http://schemas.openxmlformats.org/drawingml/2006/main" xmlns:pic="http://schemas.openxmlformats.org/drawingml/2006/picture">
-            <wp:extent cx="6264000" cy="2156523"/>
+            <wp:extent cx="6264000" cy="2170558"/>
             <wp:docPr id="6" name="Picture 6"/>
             <wp:cNvGraphicFramePr>
               <a:graphicFrameLocks noChangeAspect="1"/>
@@ -1562,7 +1562,7 @@
                   <pic:spPr>
                     <a:xfrm>
                       <a:off x="0" y="0"/>
-                      <a:ext cx="6264000" cy="2156523"/>
+                      <a:ext cx="6264000" cy="2170558"/>
                     </a:xfrm>
                     <a:prstGeom prst="rect"/>
                   </pic:spPr>
@@ -2498,7 +2498,7 @@
       <w:r>
         <w:drawing>
           <wp:inline xmlns:a="http://schemas.openxmlformats.org/drawingml/2006/main" xmlns:pic="http://schemas.openxmlformats.org/drawingml/2006/picture">
-            <wp:extent cx="6264000" cy="2522757"/>
+            <wp:extent cx="6264000" cy="2514300"/>
             <wp:docPr id="7" name="Picture 7"/>
             <wp:cNvGraphicFramePr>
               <a:graphicFrameLocks noChangeAspect="1"/>
@@ -2519,7 +2519,7 @@
                   <pic:spPr>
                     <a:xfrm>
                       <a:off x="0" y="0"/>
-                      <a:ext cx="6264000" cy="2522757"/>
+                      <a:ext cx="6264000" cy="2514300"/>
                     </a:xfrm>
                     <a:prstGeom prst="rect"/>
                   </pic:spPr>

</xml_diff>

<commit_message>
text: corrections from a full reread, each checked against the data
Claims that went beyond the data were reworded or removed; numbers that were typed by
hand are now computed from result files. Details in the diff of build_manuscript.py.

Co-Authored-By: Claude Opus 5.5 <noreply@anthropic.com>
</commit_message>
<xml_diff>
--- a/manuscript/submission/Manuscript_Tau_Borophene_JMM.docx
+++ b/manuscript/submission/Manuscript_Tau_Borophene_JMM.docx
@@ -112,7 +112,7 @@
       </w:r>
       <w:r>
         <w:rPr/>
-        <w:t xml:space="preserve"> borophene. Docking into the ligand-free fibril does not reproduce the tracer pose (root-mean-square deviation 6.7 and 6.3 Å); the docking scores are therefore exploratory. An unconstrained finite borophene flake collapses into a compact boron cluster during adsorption, so the carrier was modelled as a planar B</w:t>
+        <w:t xml:space="preserve"> borophene. Docking into the ligand-free fibril does not reproduce the tracer pose (root-mean-square deviation 6.7 and 6.3 Å); the docking scores are therefore exploratory. An unconstrained borophene flake reconstructs into a compact cluster during adsorption, so the carrier was modelled as a planar B</w:t>
       </w:r>
       <w:r>
         <w:rPr>
@@ -399,7 +399,7 @@
       </w:r>
       <w:r>
         <w:rPr/>
-        <w:t xml:space="preserve"> flake relaxed without constraints, was a local minimum (no imaginary frequencies) but not a stable carrier: in every adsorption complex it contracted into a more compact boron cluster, lowering its own energy by up to 110.7 kcal mol</w:t>
+        <w:t xml:space="preserve"> flake relaxed without constraints, was a local minimum (no imaginary frequencies) but not a stable carrier: in 17 of 28 adsorption complexes its energy fell below that of the isolated flake as it contracted toward a more compact boron cluster, by up to 110.7 kcal mol</w:t>
       </w:r>
       <w:r>
         <w:rPr>
@@ -409,7 +409,7 @@
       </w:r>
       <w:r>
         <w:rPr/>
-        <w:t xml:space="preserve"> (Table S2), so that the computed binding energies were dominated by the reconstruction of the carrier. Because borophene exists only on a supporting metal, which holds it planar [13, 14], the carrier was rebuilt as a substrate-supported sheet. A planar β</w:t>
+        <w:t xml:space="preserve"> (Table S2), so that the computed binding energies contained the energy of the reconstruction of the carrier. Because borophene exists only on a supporting metal, which holds it planar [13, 14], the carrier was rebuilt as a substrate-supported sheet. A planar β</w:t>
       </w:r>
       <w:r>
         <w:rPr>
@@ -1272,7 +1272,7 @@
       </w:r>
       <w:r>
         <w:rPr/>
-        <w:t>), which bind a metallic sheet through electrostatic polarisation in addition to dispersion; among neutral physisorbed drugs Δ</w:t>
+        <w:t>), consistent with electrostatic polarisation of the metallic sheet in addition to dispersion, although the energy was not decomposed; among neutral physisorbed drugs Δ</w:t>
       </w:r>
       <w:r>
         <w:rPr>
@@ -1334,7 +1334,7 @@
       </w:r>
       <w:r>
         <w:rPr/>
-        <w:t xml:space="preserve"> for dyes and probes, −54.2 for polyphenols, −32.3 for modulators and −25.1 for symptomatic drugs. In the gas phase the cation–sheet attraction is not screened; in water it would be much weaker, so the gap between cationic and neutral drugs is an upper bound.</w:t>
+        <w:t xml:space="preserve"> for dyes and probes, −54.2 for polyphenols, −32.3 for modulators and −25.1 for symptomatic drugs. In the gas phase the cation–sheet attraction is not screened; in water it would be weaker, so the gap between cationic and neutral drugs is likely overestimated here.</w:t>
       </w:r>
     </w:p>
     <w:p>
@@ -2378,7 +2378,7 @@
       </w:r>
       <w:r>
         <w:rPr/>
-        <w:t xml:space="preserve"> = 0.006; Fig. 3b). The trend is carried by the extended, planar dyes, which fit the elongated cleft and stack on the sheet, and by the small aliphatic symptomatic drugs, which do neither well; it should not be read as a mechanistic link between the two endpoints.</w:t>
+        <w:t xml:space="preserve"> = 0.006; Fig. 3b). The trend appears to come from the two ends of the cohort: the extended, planar dyes, which fit the elongated cleft and stack on the sheet, and the small aliphatic symptomatic drugs, which do neither well; it should not be read as a mechanistic link between the two endpoints.</w:t>
       </w:r>
     </w:p>
     <w:p>
@@ -3262,7 +3262,7 @@
       </w:pPr>
       <w:r>
         <w:rPr/>
-        <w:t>Docking into the ligand-free PHF of PDB 8FUG places nearly every drug on Gln351, Ser352 and Lys353, but it does not reproduce the stacked GTP-1 pose, and its scores are exploratory. A finite, unconstrained borophene flake is not a usable carrier model at the GFN2-xTB level, because it collapses during adsorption; a planar sheet held at the β</w:t>
+        <w:t>Docking into the ligand-free PHF of PDB 8FUG places nearly every drug on Gln351, Ser352 and Lys353, but it does not reproduce the stacked GTP-1 pose, and its scores are exploratory. A finite, unconstrained borophene flake is not a usable carrier model at the GFN2-xTB level, because it reconstructs during adsorption; a planar sheet held at the β</w:t>
       </w:r>
       <w:r>
         <w:rPr>

</xml_diff>

<commit_message>
AI-use statement approved by the author and inserted; manuscripts and packages rebuilt
Co-Authored-By: Claude Opus 5.5 <noreply@anthropic.com>
</commit_message>
<xml_diff>
--- a/manuscript/submission/Manuscript_Tau_Borophene_JMM.docx
+++ b/manuscript/submission/Manuscript_Tau_Borophene_JMM.docx
@@ -682,12 +682,13 @@
       </w:r>
     </w:p>
     <w:p>
-      <w:r>
-        <w:rPr>
-          <w:b/>
-          <w:highlight w:val="yellow"/>
-        </w:rPr>
-        <w:t>[AUTHOR TO COMPLETE BEFORE SUBMISSION: statement on the use of AI tools in this work, as required by the journal (Springer policy: use of large language models beyond copy editing must be documented in the Methods).]</w:t>
+      <w:pPr>
+        <w:ind w:firstLine="340"/>
+        <w:jc w:val="both"/>
+      </w:pPr>
+      <w:r>
+        <w:rPr/>
+        <w:t>The large language model Claude (Anthropic), used through the Claude Code interface, assisted in writing and debugging the scripts for the calculations, analyses, figures and independent re-checks of the results, in checking the references against Crossref, and in drafting and editing the text. The author designed the study, checked the code, results and text, and takes full responsibility for the content of this article.</w:t>
       </w:r>
     </w:p>
     <w:p>

</xml_diff>